<commit_message>
deploy para server test
</commit_message>
<xml_diff>
--- a/diccionarios/Computadores/diccionario_features.docx
+++ b/diccionarios/Computadores/diccionario_features.docx
@@ -63,7 +63,23 @@
         <w:pStyle w:val="Listaconvietas"/>
       </w:pPr>
       <w:r>
+        <w:t>- LPDDR4X</w:t>
+      </w:r>
+    </w:p>
+    <w:p>
+      <w:pPr>
+        <w:pStyle w:val="Listaconvietas"/>
+      </w:pPr>
+      <w:r>
         <w:t>- LPDDR5</w:t>
+      </w:r>
+    </w:p>
+    <w:p>
+      <w:pPr>
+        <w:pStyle w:val="Listaconvietas"/>
+      </w:pPr>
+      <w:r>
+        <w:t>- LPDDR5X</w:t>
       </w:r>
     </w:p>
     <w:p>

</xml_diff>

<commit_message>
Revert "feat: add POST /catalogar/texto endpoint"
</commit_message>
<xml_diff>
--- a/diccionarios/Computadores/diccionario_features.docx
+++ b/diccionarios/Computadores/diccionario_features.docx
@@ -63,23 +63,7 @@
         <w:pStyle w:val="Listaconvietas"/>
       </w:pPr>
       <w:r>
-        <w:t>- LPDDR4X</w:t>
-      </w:r>
-    </w:p>
-    <w:p>
-      <w:pPr>
-        <w:pStyle w:val="Listaconvietas"/>
-      </w:pPr>
-      <w:r>
         <w:t>- LPDDR5</w:t>
-      </w:r>
-    </w:p>
-    <w:p>
-      <w:pPr>
-        <w:pStyle w:val="Listaconvietas"/>
-      </w:pPr>
-      <w:r>
-        <w:t>- LPDDR5X</w:t>
       </w:r>
     </w:p>
     <w:p>

</xml_diff>